<commit_message>
Corrige enunciados da Usina (caldeira comum) e da Plásticos (base porta-moldes comum)
Co-Authored-By: Claude Opus 5.5 <noreply@anthropic.com>
Claude-Session: https://claude.ai/code/session_011MUGNEMWRsLJUKMUMKSx3L
</commit_message>
<xml_diff>
--- a/arquivos/Plasticos_Vale_do_Teles_Pires_Custeio_Absorcao_Enunciado.docx
+++ b/arquivos/Plasticos_Vale_do_Teles_Pires_Custeio_Absorcao_Enunciado.docx
@@ -38,7 +38,7 @@
         <w:spacing w:after="120"/>
       </w:pPr>
       <w:r>
-        <w:t xml:space="preserve">A Plásticos Vale do Teles Pires Ltda., indústria de injeção plástica instalada em Sinop (MT), fabrica embalagens plásticas para o agronegócio e para a indústria de alimentos: baldes de 20 litros, potes de 500 ml e frascos de 250 ml. Cada produto é fabricado em um molde próprio, instalado na mesma injetora. Trocar de produto exige parar a máquina, retirar o molde atual, instalar o novo molde e recalibrar o processo — uma operação chamada "troca de molde" (setup) — e os três produtos são fabricados em lotes ao longo do ano, com números de trocas de molde bem diferentes entre si. Estima-se que a fábrica permanecerá em operação por longo prazo. No último ano, foram produzidas e vendidas 200.000 unidades de baldes, 500.000 unidades de potes e 300.000 unidades de frascos, sem formação de estoque final de produtos acabados. A controladoria da empresa apura seus resultados pelo custeio por absorção, alocando todos os custos de produção (diretos e indiretos) aos produtos.</w:t>
+        <w:t>A Plásticos Vale do Teles Pires Ltda., indústria de injeção plástica instalada em Sinop (MT), fabrica embalagens plásticas para o agronegócio e para a indústria de alimentos: baldes de 20 litros, potes de 500 ml e frascos de 250 ml. Cada produto é fabricado em um molde próprio (já totalmente depreciado), montado sobre uma base porta-moldes comum, na mesma injetora. Trocar de produto exige parar a máquina, retirar o molde atual, instalar o novo molde e recalibrar o processo — uma operação chamada "troca de molde" (setup) — e os três produtos são fabricados em lotes ao longo do ano, com números de trocas de molde bem diferentes entre si. Estima-se que a fábrica permanecerá em operação por longo prazo. No último ano, foram produzidas e vendidas 200.000 unidades de baldes, 500.000 unidades de potes e 300.000 unidades de frascos, sem formação de estoque final de produtos acabados. A controladoria da empresa apura seus resultados pelo custeio por absorção, alocando todos os custos de produção (diretos e indiretos) aos produtos.</w:t>
       </w:r>
     </w:p>
     <w:p>
@@ -873,7 +873,7 @@
                 <w:i w:val="false"/>
                 <w:iCs w:val="false"/>
               </w:rPr>
-              <w:t>Depreciação dos moldes (equipamento $ 300.000, vida útil 10 anos, taxa de depreciação de 10% a.a.)</w:t>
+              <w:t>Depreciação da base porta-moldes e do sistema de refrigeração, comuns aos três moldes (equipamento $ 300.000, vida útil 10 anos, taxa de depreciação de 10% a.a.)</w:t>
             </w:r>
           </w:p>
         </w:tc>
@@ -1177,7 +1177,7 @@
           <w:i/>
           <w:iCs/>
         </w:rPr>
-        <w:t xml:space="preserve">Observação: a resina, a MOD e a energia de injeção já estão apresentadas como o total anual consumido por cada produto. O custo de setup (troca de molde) também é diretamente atribuível a cada produto — cada um sabe exatamente quantas trocas de molde precisou ao longo do ano — mas seu total no ano depende do número de lotes de produção, não do volume produzido, por isso é chamado de custo direto "fixo por lote". Já o aluguel do galpão, a depreciação das injetoras e dos moldes, e a supervisão beneficiam os três produtos ao mesmo tempo e precisam ser rateados.</w:t>
+        <w:t>Observação: a resina, a MOD e a energia de injeção já estão apresentadas como o total anual consumido por cada produto. O custo de setup (troca de molde) também é diretamente atribuível a cada produto — cada um sabe exatamente quantas trocas de molde precisou ao longo do ano — mas seu total no ano depende do número de lotes de produção, não do volume produzido, por isso é chamado de custo direto "fixo por lote". Já o aluguel do galpão, a depreciação das injetoras e da base porta-moldes, e a supervisão beneficiam os três produtos ao mesmo tempo e precisam ser rateados.</w:t>
       </w:r>
     </w:p>
     <w:p>
@@ -1986,7 +1986,7 @@
         <w:spacing w:after="120"/>
       </w:pPr>
       <w:r>
-        <w:t xml:space="preserve">b) Os custos indiretos de produção (aluguel do galpão, depreciação das injetoras e dos moldes, e supervisão) precisam ser rateados entre os três produtos. Faça o rateio proporcionalmente ao volume produzido de cada um e calcule o custo de produção total (direto + indireto) e o custo unitário de cada produto pelo custeio por absorção.</w:t>
+        <w:t>b) Os custos indiretos de produção (aluguel do galpão, depreciação das injetoras e da base porta-moldes, e supervisão) precisam ser rateados entre os três produtos. Faça o rateio proporcionalmente ao volume produzido de cada um e calcule o custo de produção total (direto + indireto) e o custo unitário de cada produto pelo custeio por absorção.</w:t>
       </w:r>
     </w:p>
     <w:p>
@@ -2010,7 +2010,7 @@
         <w:spacing w:after="120"/>
       </w:pPr>
       <w:r>
-        <w:t xml:space="preserve">e) Um fornecedor terceirizado propõe entregar prontas as 500.000 unidades de potes do ano por $ 410.000,00, sem que a fábrica precise mais produzi-las internamente (as injetoras, os moldes comuns e a supervisão continuariam sendo usados para baldes e frascos). Um analista júnior comparou essa proposta com o custo unitário de produção dos potes pelo custeio por absorção (letras b e d) para decidir. Essa comparação está correta? Refaça a análise da forma correta e conclua se a proposta deveria ser aceita.</w:t>
+        <w:t>e) Um fornecedor terceirizado propõe entregar prontas as 500.000 unidades de potes do ano por $ 410.000,00, sem que a fábrica precise mais produzi-las internamente (as injetoras, a base porta-moldes e a supervisão continuariam sendo usados para baldes e frascos). Um analista júnior comparou essa proposta com o custo unitário de produção dos potes pelo custeio por absorção (letras b e d) para decidir. Essa comparação está correta? Refaça a análise da forma correta e conclua se a proposta deveria ser aceita.</w:t>
       </w:r>
     </w:p>
     <w:p>

</xml_diff>